<commit_message>
docs(sms): update SMS module document for central contracts, file attachments and panel disable
Co-Authored-By: Claude Sonnet 5.5 <noreply@anthropic.com>
</commit_message>
<xml_diff>
--- a/doc/sms_module.docx
+++ b/doc/sms_module.docx
@@ -3100,42 +3100,94 @@
           <w:szCs w:val="32"/>
           <w:rtl w:val="true"/>
         </w:rPr>
-        <w:t xml:space="preserve">پس از ثبت تاییدیه و امضای الکترونیک، رکورد آن با آی‌پی و زمان معتبر در جدول </w:t>
-      </w:r>
-      <w:r>
-        <w:rPr>
-          <w:rFonts w:cs="IRNazanin" w:ascii="IRNazanin" w:hAnsi="IRNazanin"/>
-          <w:sz w:val="32"/>
-          <w:szCs w:val="32"/>
-        </w:rPr>
-        <w:t>sms_contract_signatures</w:t>
-      </w:r>
-      <w:r>
-        <w:rPr>
-          <w:rFonts w:cs="IRNazanin" w:ascii="IRNazanin" w:hAnsi="IRNazanin"/>
-          <w:sz w:val="32"/>
-          <w:szCs w:val="32"/>
-          <w:rtl w:val="true"/>
-        </w:rPr>
-        <w:t xml:space="preserve"> </w:t>
-      </w:r>
-      <w:r>
-        <w:rPr>
-          <w:rFonts w:ascii="IRNazanin" w:hAnsi="IRNazanin" w:cs="IRNazanin"/>
-          <w:sz w:val="32"/>
-          <w:szCs w:val="32"/>
-          <w:rtl w:val="true"/>
-        </w:rPr>
-        <w:t>ثبت شده و امکان ارسال و ایجاد کمپین برای کسب‌وکار فعال می‌گردد</w:t>
-      </w:r>
-      <w:r>
-        <w:rPr>
-          <w:rFonts w:cs="IRNazanin" w:ascii="IRNazanin" w:hAnsi="IRNazanin"/>
-          <w:sz w:val="32"/>
-          <w:szCs w:val="32"/>
-          <w:rtl w:val="true"/>
-        </w:rPr>
-        <w:t>.</w:t>
+        <w:t xml:space="preserve">پس از تأیید با کد پیامکی، امضا مانند امضای فاکتورها در بخش مرکزی قراردادها ثبت می‌شود: یک سطر در سوابق (histories) کسب‌وکار شامل نام امضاکننده، شماره، تأیید کد و هش متن، به‌همراه نسخه ثابت متن امضاشده در contract_views. سپس امکان ارسال و ایجاد کمپین برای کسب‌وکار فعال می‌گردد.</w:t>
+      </w:r>
+    </w:p>
+    <w:p>
+      <w:pPr>
+        <w:pStyle w:val="BodyText"/>
+        <w:numPr>
+          <w:ilvl w:val="0"/>
+          <w:numId w:val="7"/>
+        </w:numPr>
+        <w:tabs>
+          <w:tab w:val="left" w:pos="709" w:leader="none"/>
+        </w:tabs>
+        <w:bidi w:val="1"/>
+        <w:ind w:hanging="283" w:start="709"/>
+        <w:jc w:val="start"/>
+        <w:rPr>
+          <w:rFonts w:ascii="IRNazanin" w:hAnsi="IRNazanin" w:cs="IRNazanin"/>
+          <w:sz w:val="32"/>
+          <w:szCs w:val="32"/>
+        </w:rPr>
+      </w:pPr>
+      <w:r>
+        <w:rPr>
+          <w:rFonts w:ascii="IRNazanin" w:hAnsi="IRNazanin" w:cs="IRNazanin"/>
+          <w:sz w:val="32"/>
+          <w:szCs w:val="32"/>
+          <w:rtl w:val="true"/>
+        </w:rPr>
+        <w:t xml:space="preserve">قراردادهای پیامک اکنون در همان بخش مرکزی قراردادها نگهداری می‌شوند و به‌صورت «الگوی قرارداد» برای موقعیت‌های OTP و تبلیغاتی (ContractUsage) به کسب‌وکارها تخصیص می‌یابند؛ سامانه قرارداد مستقل پیامک حذف شده است.</w:t>
+      </w:r>
+    </w:p>
+    <w:p>
+      <w:pPr>
+        <w:pStyle w:val="BodyText"/>
+        <w:numPr>
+          <w:ilvl w:val="0"/>
+          <w:numId w:val="7"/>
+        </w:numPr>
+        <w:tabs>
+          <w:tab w:val="left" w:pos="709" w:leader="none"/>
+        </w:tabs>
+        <w:bidi w:val="1"/>
+        <w:ind w:hanging="283" w:start="709"/>
+        <w:jc w:val="start"/>
+        <w:rPr>
+          <w:rFonts w:ascii="IRNazanin" w:hAnsi="IRNazanin" w:cs="IRNazanin"/>
+          <w:sz w:val="32"/>
+          <w:szCs w:val="32"/>
+        </w:rPr>
+      </w:pPr>
+      <w:r>
+        <w:rPr>
+          <w:rFonts w:ascii="IRNazanin" w:hAnsi="IRNazanin" w:cs="IRNazanin"/>
+          <w:sz w:val="32"/>
+          <w:szCs w:val="32"/>
+          <w:rtl w:val="true"/>
+        </w:rPr>
+        <w:t xml:space="preserve">پیوست فایل: مدیر تا ۵ فایل و کسب‌وکار تا ۵ فایل (pdf، doc، docx، jpg، jpeg، png؛ حداکثر ۱۰ مگابایت برای هر فایل) پیوست می‌کند. مدیر هر فایل کسب‌وکار را تأیید یا با درج دلیل رد می‌کند و کسب‌وکار تنها فایل‌های ردشده را دوباره می‌فرستد. پس از امضا، فایل‌های مدیر قفل می‌شوند. الگوی قرارداد بدون فایل می‌ماند و هنگام واگذاری همراه با فایل، قرارداد اختصاصی تازه‌ای ساخته می‌شود.</w:t>
+      </w:r>
+    </w:p>
+    <w:p>
+      <w:pPr>
+        <w:pStyle w:val="BodyText"/>
+        <w:numPr>
+          <w:ilvl w:val="0"/>
+          <w:numId w:val="7"/>
+        </w:numPr>
+        <w:tabs>
+          <w:tab w:val="left" w:pos="709" w:leader="none"/>
+        </w:tabs>
+        <w:bidi w:val="1"/>
+        <w:ind w:hanging="283" w:start="709"/>
+        <w:jc w:val="start"/>
+        <w:rPr>
+          <w:rFonts w:ascii="IRNazanin" w:hAnsi="IRNazanin" w:cs="IRNazanin"/>
+          <w:sz w:val="32"/>
+          <w:szCs w:val="32"/>
+        </w:rPr>
+      </w:pPr>
+      <w:r>
+        <w:rPr>
+          <w:rFonts w:ascii="IRNazanin" w:hAnsi="IRNazanin" w:cs="IRNazanin"/>
+          <w:sz w:val="32"/>
+          <w:szCs w:val="32"/>
+          <w:rtl w:val="true"/>
+        </w:rPr>
+        <w:t xml:space="preserve">غیرفعال‌سازی پنل: سوپرادمین می‌تواند پنل OTP یا تبلیغاتی هر کسب‌وکار را با درج دلیل غیرفعال کند. در این حالت ارسال‌های جدید (تکی، گروهی و کمپین) متوقف می‌شود و گزارش‌ها همچنان در دسترس است.</w:t>
       </w:r>
     </w:p>
     <w:p>
@@ -7124,103 +7176,7 @@
           <w:szCs w:val="32"/>
           <w:rtl w:val="true"/>
         </w:rPr>
-        <w:t xml:space="preserve">قراردادها و </w:t>
-      </w:r>
-      <w:r>
-        <w:rPr>
-          <w:rFonts w:cs="IRNazanin" w:ascii="IRNazanin" w:hAnsi="IRNazanin"/>
-          <w:b/>
-          <w:sz w:val="32"/>
-          <w:szCs w:val="32"/>
-        </w:rPr>
-        <w:t>CMS</w:t>
-      </w:r>
-      <w:r>
-        <w:rPr>
-          <w:rFonts w:cs="IRNazanin" w:ascii="IRNazanin" w:hAnsi="IRNazanin"/>
-          <w:b/>
-          <w:sz w:val="32"/>
-          <w:szCs w:val="32"/>
-          <w:rtl w:val="true"/>
-        </w:rPr>
-        <w:t xml:space="preserve"> </w:t>
-      </w:r>
-      <w:r>
-        <w:rPr>
-          <w:rFonts w:ascii="IRNazanin" w:hAnsi="IRNazanin" w:cs="IRNazanin"/>
-          <w:b/>
-          <w:b/>
-          <w:sz w:val="32"/>
-          <w:szCs w:val="32"/>
-          <w:rtl w:val="true"/>
-        </w:rPr>
-        <w:t xml:space="preserve">حقوقی </w:t>
-      </w:r>
-      <w:r>
-        <w:rPr>
-          <w:rFonts w:cs="IRNazanin" w:ascii="IRNazanin" w:hAnsi="IRNazanin"/>
-          <w:b/>
-          <w:sz w:val="32"/>
-          <w:szCs w:val="32"/>
-          <w:rtl w:val="true"/>
-        </w:rPr>
-        <w:t>(</w:t>
-      </w:r>
-      <w:r>
-        <w:rPr>
-          <w:rFonts w:cs="IRNazanin" w:ascii="IRNazanin" w:hAnsi="IRNazanin"/>
-          <w:b/>
-          <w:sz w:val="32"/>
-          <w:szCs w:val="32"/>
-          <w:rtl w:val="true"/>
-        </w:rPr>
-        <w:t>/</w:t>
-      </w:r>
-      <w:r>
-        <w:rPr>
-          <w:rFonts w:cs="IRNazanin" w:ascii="IRNazanin" w:hAnsi="IRNazanin"/>
-          <w:b/>
-          <w:sz w:val="32"/>
-          <w:szCs w:val="32"/>
-        </w:rPr>
-        <w:t>contracts</w:t>
-      </w:r>
-      <w:r>
-        <w:rPr>
-          <w:rFonts w:cs="IRNazanin" w:ascii="IRNazanin" w:hAnsi="IRNazanin"/>
-          <w:b/>
-          <w:sz w:val="32"/>
-          <w:szCs w:val="32"/>
-          <w:rtl w:val="true"/>
-        </w:rPr>
-        <w:t>):</w:t>
-      </w:r>
-      <w:r>
-        <w:rPr>
-          <w:rFonts w:cs="IRNazanin" w:ascii="IRNazanin" w:hAnsi="IRNazanin"/>
-          <w:sz w:val="32"/>
-          <w:szCs w:val="32"/>
-          <w:rtl w:val="true"/>
-        </w:rPr>
-        <w:t xml:space="preserve"> </w:t>
-      </w:r>
-      <w:r>
-        <w:rPr>
-          <w:rFonts w:ascii="IRNazanin" w:hAnsi="IRNazanin" w:cs="IRNazanin"/>
-          <w:sz w:val="32"/>
-          <w:szCs w:val="32"/>
-          <w:rtl w:val="true"/>
-        </w:rPr>
-        <w:t>درج و به‌روزرسانی متن قراردادهای رگولاتوری توسط سوپرادمین</w:t>
-      </w:r>
-      <w:r>
-        <w:rPr>
-          <w:rFonts w:cs="IRNazanin" w:ascii="IRNazanin" w:hAnsi="IRNazanin"/>
-          <w:sz w:val="32"/>
-          <w:szCs w:val="32"/>
-          <w:rtl w:val="true"/>
-        </w:rPr>
-        <w:t>.</w:t>
+        <w:t xml:space="preserve">بانک قراردادها و الگوهای قرارداد (/contracts): مدیریت الگوهای قرارداد پیامک در بخش مرکزی قراردادها توسط سوپرادمین، تخصیص الگوی قرارداد به کسب‌وکار، پیوست فایل، تأیید یا رد فایل‌های کسب‌وکار و غیرفعال‌سازی پنل هر کسب‌وکار.</w:t>
       </w:r>
     </w:p>
     <w:p>
@@ -8345,7 +8301,7 @@
                 <w:sz w:val="32"/>
                 <w:szCs w:val="32"/>
               </w:rPr>
-              <w:t>sms_contract_signatures</w:t>
+              <w:t xml:space="preserve">histories / contract_views</w:t>
             </w:r>
           </w:p>
         </w:tc>
@@ -8374,7 +8330,7 @@
                 <w:sz w:val="32"/>
                 <w:szCs w:val="32"/>
               </w:rPr>
-              <w:t>SmsContractSignature</w:t>
+              <w:t xml:space="preserve">History / ContractView</w:t>
             </w:r>
           </w:p>
         </w:tc>
@@ -8405,42 +8361,7 @@
                 <w:szCs w:val="32"/>
                 <w:rtl w:val="true"/>
               </w:rPr>
-              <w:t xml:space="preserve">سوابق امضای تعهدنامه حقوقی توسط غرفه‌ها </w:t>
-            </w:r>
-            <w:r>
-              <w:rPr>
-                <w:rFonts w:cs="IRNazanin" w:ascii="IRNazanin" w:hAnsi="IRNazanin"/>
-                <w:sz w:val="32"/>
-                <w:szCs w:val="32"/>
-                <w:rtl w:val="true"/>
-              </w:rPr>
-              <w:t>(</w:t>
-            </w:r>
-            <w:r>
-              <w:rPr>
-                <w:rFonts w:cs="IRNazanin" w:ascii="IRNazanin" w:hAnsi="IRNazanin"/>
-                <w:sz w:val="32"/>
-                <w:szCs w:val="32"/>
-              </w:rPr>
-              <w:t>IP</w:t>
-            </w:r>
-            <w:r>
-              <w:rPr>
-                <w:rFonts w:ascii="IRNazanin" w:hAnsi="IRNazanin" w:cs="IRNazanin"/>
-                <w:sz w:val="32"/>
-                <w:szCs w:val="32"/>
-                <w:rtl w:val="true"/>
-              </w:rPr>
-              <w:t>، شناسه کاربر و زمان امضا</w:t>
-            </w:r>
-            <w:r>
-              <w:rPr>
-                <w:rFonts w:cs="IRNazanin" w:ascii="IRNazanin" w:hAnsi="IRNazanin"/>
-                <w:sz w:val="32"/>
-                <w:szCs w:val="32"/>
-                <w:rtl w:val="true"/>
-              </w:rPr>
-              <w:t>)</w:t>
+              <w:t xml:space="preserve">سوابق امضای تعهدنامه در بخش مرکزی قراردادها: سطر امضا (نام، شماره، تأیید کد، هش متن) و نسخه ثابت متن امضاشده؛ جدول sms_contract_signatures دیگر استفاده نمی‌شود</w:t>
             </w:r>
           </w:p>
         </w:tc>
@@ -9112,34 +9033,7 @@
           <w:sz w:val="32"/>
           <w:szCs w:val="32"/>
         </w:rPr>
-        <w:t>SmsContractSignController</w:t>
-      </w:r>
-      <w:r>
-        <w:rPr>
-          <w:rFonts w:cs="IRNazanin" w:ascii="IRNazanin" w:hAnsi="IRNazanin"/>
-          <w:sz w:val="32"/>
-          <w:szCs w:val="32"/>
-          <w:rtl w:val="true"/>
-        </w:rPr>
-        <w:t xml:space="preserve">: </w:t>
-      </w:r>
-      <w:r>
-        <w:rPr>
-          <w:rFonts w:ascii="IRNazanin" w:hAnsi="IRNazanin" w:cs="IRNazanin"/>
-          <w:sz w:val="32"/>
-          <w:szCs w:val="32"/>
-          <w:rtl w:val="true"/>
-        </w:rPr>
-        <w:t>مدیریت نمایش و ثبت امضای الکترونیک قرارداد</w:t>
-      </w:r>
-      <w:r>
-        <w:rPr>
-          <w:rFonts w:cs="IRNazanin" w:ascii="IRNazanin" w:hAnsi="IRNazanin"/>
-          <w:sz w:val="32"/>
-          <w:szCs w:val="32"/>
-          <w:rtl w:val="true"/>
-        </w:rPr>
-        <w:t>.</w:t>
+        <w:t xml:space="preserve">SmsContractSignController و SmsContractController: نمایش و ثبت امضای قرارداد، مدیریت الگوهای قرارداد، فایل‌ها و غیرفعال‌سازی پنل؛ منطق در SmsContractService و SmsContractFilesService و SmsPanelAccess.</w:t>
       </w:r>
     </w:p>
     <w:p>
@@ -10671,6 +10565,102 @@
           <w:rtl w:val="true"/>
         </w:rPr>
         <w:t>.</w:t>
+      </w:r>
+    </w:p>
+    <w:p>
+      <w:pPr>
+        <w:pStyle w:val="Heading4"/>
+        <w:numPr>
+          <w:ilvl w:val="3"/>
+          <w:numId w:val="1"/>
+        </w:numPr>
+        <w:bidi w:val="1"/>
+        <w:ind w:hanging="0" w:start="0"/>
+        <w:jc w:val="start"/>
+        <w:rPr>
+          <w:rFonts w:ascii="IRNazanin" w:hAnsi="IRNazanin" w:cs="IRNazanin"/>
+          <w:sz w:val="34"/>
+          <w:szCs w:val="34"/>
+        </w:rPr>
+      </w:pPr>
+      <w:r>
+        <w:rPr>
+          <w:rFonts w:ascii="IRNazanin" w:hAnsi="IRNazanin" w:cs="IRNazanin"/>
+          <w:sz w:val="34"/>
+          <w:szCs w:val="34"/>
+        </w:rPr>
+        <w:t xml:space="preserve">۶. چرا پیام «پنل شما توسط مدیریت غیرفعال شده است» نمایش داده می‌شود؟</w:t>
+      </w:r>
+    </w:p>
+    <w:p>
+      <w:pPr>
+        <w:pStyle w:val="BlockQuotationuser"/>
+        <w:bidi w:val="1"/>
+        <w:jc w:val="start"/>
+        <w:rPr>
+          <w:rFonts w:ascii="IRNazanin" w:hAnsi="IRNazanin" w:cs="IRNazanin"/>
+          <w:sz w:val="32"/>
+          <w:szCs w:val="32"/>
+        </w:rPr>
+      </w:pPr>
+      <w:r>
+        <w:rPr>
+          <w:rFonts w:ascii="IRNazanin" w:hAnsi="IRNazanin" w:cs="IRNazanin"/>
+          <w:b/>
+          <w:b/>
+          <w:sz w:val="32"/>
+          <w:szCs w:val="32"/>
+          <w:rtl w:val="true"/>
+        </w:rPr>
+        <w:t xml:space="preserve">علت: مدیریت پنل OTP یا تبلیغاتی این کسب‌وکار را غیرفعال کرده است (برای نمونه به‌دلیل ارائه نشدن مدارک). ارسال جدید ممکن نیست، اما گزارش‌ها در دسترس است؛ پس از فعال‌سازی توسط مدیریت، ارسال دوباره امکان‌پذیر می‌شود.</w:t>
+      </w:r>
+    </w:p>
+    <w:p>
+      <w:pPr>
+        <w:pStyle w:val="Heading4"/>
+        <w:numPr>
+          <w:ilvl w:val="3"/>
+          <w:numId w:val="1"/>
+        </w:numPr>
+        <w:bidi w:val="1"/>
+        <w:ind w:hanging="0" w:start="0"/>
+        <w:jc w:val="start"/>
+        <w:rPr>
+          <w:rFonts w:ascii="IRNazanin" w:hAnsi="IRNazanin" w:cs="IRNazanin"/>
+          <w:sz w:val="34"/>
+          <w:szCs w:val="34"/>
+        </w:rPr>
+      </w:pPr>
+      <w:r>
+        <w:rPr>
+          <w:rFonts w:ascii="IRNazanin" w:hAnsi="IRNazanin" w:cs="IRNazanin"/>
+          <w:sz w:val="34"/>
+          <w:szCs w:val="34"/>
+        </w:rPr>
+        <w:t xml:space="preserve">۷. چرا فایل بارگذاری‌شده من رد شد و چه باید کرد؟</w:t>
+      </w:r>
+    </w:p>
+    <w:p>
+      <w:pPr>
+        <w:pStyle w:val="BlockQuotationuser"/>
+        <w:bidi w:val="1"/>
+        <w:jc w:val="start"/>
+        <w:rPr>
+          <w:rFonts w:ascii="IRNazanin" w:hAnsi="IRNazanin" w:cs="IRNazanin"/>
+          <w:sz w:val="32"/>
+          <w:szCs w:val="32"/>
+        </w:rPr>
+      </w:pPr>
+      <w:r>
+        <w:rPr>
+          <w:rFonts w:ascii="IRNazanin" w:hAnsi="IRNazanin" w:cs="IRNazanin"/>
+          <w:b/>
+          <w:b/>
+          <w:sz w:val="32"/>
+          <w:szCs w:val="32"/>
+          <w:rtl w:val="true"/>
+        </w:rPr>
+        <w:t xml:space="preserve">علت: مدیر فایل را با ذکر دلیل رد کرده است. دلیل در صفحه قرارداد نمایش داده می‌شود؛ تنها فایل‌های ردشده را دوباره بارگذاری کنید (حداکثر ۵ فایل، فرمت pdf، doc، docx، jpg، jpeg یا png و تا ۱۰ مگابایت برای هر فایل).</w:t>
       </w:r>
     </w:p>
     <w:p>

</xml_diff>